<commit_message>
Rolls report 1606-2026: three rolls tested, JG-2305-102HLB-2 passed
Co-Authored-By: Claude Opus 5.5 <noreply@anthropic.com>
Claude-Session: https://claude.ai/code/session_01DhfrxujFdtSZWrLQm5rNqB
</commit_message>
<xml_diff>
--- a/Акт_несоответствия_валов_1606-2026_RU-EN-CN.docx
+++ b/Акт_несоответствия_валов_1606-2026_RU-EN-CN.docx
@@ -87,7 +87,7 @@
           <w:sz w:val="20"/>
           <w:szCs w:val="20"/>
         </w:rPr>
-        <w:t xml:space="preserve">Несоответствие валов требованиям · Non-conformity of the rolls with the requirements · 辊不符合要求</w:t>
+        <w:t xml:space="preserve">Результаты испытаний валов · Roll test results · 辊试验结果</w:t>
       </w:r>
     </w:p>
     <w:tbl>
@@ -506,35 +506,35 @@
                 <w:sz w:val="17"/>
                 <w:szCs w:val="17"/>
               </w:rPr>
-              <w:t xml:space="preserve">Валы (2 шт.), серийные номера: JG-2305-102HLB-1, 230717-1</w:t>
-            </w:r>
-          </w:p>
-          <w:p>
-            <w:pPr>
-              <w:spacing w:after="0"/>
-            </w:pPr>
-            <w:r>
-              <w:rPr>
-                <w:rFonts w:ascii="Calibri" w:cs="Calibri" w:eastAsia="Microsoft YaHei" w:hAnsi="Calibri"/>
-                <w:color w:val="000000"/>
-                <w:sz w:val="17"/>
-                <w:szCs w:val="17"/>
-              </w:rPr>
-              <w:t xml:space="preserve">Rolls (2 pcs), serial numbers: JG-2305-102HLB-1, 230717-1</w:t>
-            </w:r>
-          </w:p>
-          <w:p>
-            <w:pPr>
-              <w:spacing w:after="0"/>
-            </w:pPr>
-            <w:r>
-              <w:rPr>
-                <w:rFonts w:ascii="Calibri" w:cs="Calibri" w:eastAsia="Microsoft YaHei" w:hAnsi="Calibri"/>
-                <w:color w:val="000000"/>
-                <w:sz w:val="17"/>
-                <w:szCs w:val="17"/>
-              </w:rPr>
-              <w:t xml:space="preserve">辊（2 根），序列号：JG-2305-102HLB-1、230717-1</w:t>
+              <w:t xml:space="preserve">Валы (3 шт.), серийные номера: JG-2305-102HLB-1, JG-2305-102HLB-2, 230717-1</w:t>
+            </w:r>
+          </w:p>
+          <w:p>
+            <w:pPr>
+              <w:spacing w:after="0"/>
+            </w:pPr>
+            <w:r>
+              <w:rPr>
+                <w:rFonts w:ascii="Calibri" w:cs="Calibri" w:eastAsia="Microsoft YaHei" w:hAnsi="Calibri"/>
+                <w:color w:val="000000"/>
+                <w:sz w:val="17"/>
+                <w:szCs w:val="17"/>
+              </w:rPr>
+              <w:t xml:space="preserve">Rolls (3 pcs), serial numbers: JG-2305-102HLB-1, JG-2305-102HLB-2, 230717-1</w:t>
+            </w:r>
+          </w:p>
+          <w:p>
+            <w:pPr>
+              <w:spacing w:after="0"/>
+            </w:pPr>
+            <w:r>
+              <w:rPr>
+                <w:rFonts w:ascii="Calibri" w:cs="Calibri" w:eastAsia="Microsoft YaHei" w:hAnsi="Calibri"/>
+                <w:color w:val="000000"/>
+                <w:sz w:val="17"/>
+                <w:szCs w:val="17"/>
+              </w:rPr>
+              <w:t xml:space="preserve">辊（3 根），序列号：JG-2305-102HLB-1、JG-2305-102HLB-2、230717-1</w:t>
             </w:r>
           </w:p>
         </w:tc>
@@ -652,7 +652,7 @@
           <w:sz w:val="18"/>
           <w:szCs w:val="18"/>
         </w:rPr>
-        <w:t xml:space="preserve">Настоящий акт составлен по результатам приёмочных испытаний валов и фиксирует несоответствие двух валов требованиям, указанным в разделе 2. Несоответствия подлежат устранению Исполнителем в срок, указанный в разделе 3. Текст приведён на русском, английском и китайском языках — строки трёх колонок соответствуют друг другу.</w:t>
+        <w:t xml:space="preserve">Настоящий акт составлен по результатам приёмочных испытаний трёх валов. Вал JG-2305-102HLB-2 испытания прошёл; два вала не соответствуют требованиям, указанным в разделе 2. Несоответствия подлежат устранению Исполнителем в срок, указанный в разделе 3. Текст приведён на русском, английском и китайском языках — строки трёх колонок соответствуют друг другу.</w:t>
       </w:r>
     </w:p>
     <w:p>
@@ -666,7 +666,7 @@
           <w:sz w:val="17"/>
           <w:szCs w:val="17"/>
         </w:rPr>
-        <w:t xml:space="preserve">This report has been drawn up following the acceptance testing of the rolls and records the non-conformity of two rolls with the requirements specified in section 2. The non-conformities shall be rectified by the Contractor within the time limit specified in section 3. The text is given in Russian, English and Chinese, and the rows of the three columns correspond to one another.</w:t>
+        <w:t xml:space="preserve">This report has been drawn up following the acceptance testing of three rolls. Roll JG-2305-102HLB-2 has passed the tests; two rolls do not conform to the requirements specified in section 2. The non-conformities shall be rectified by the Contractor within the time limit specified in section 3. The text is given in Russian, English and Chinese, and the rows of the three columns correspond to one another.</w:t>
       </w:r>
     </w:p>
     <w:p>
@@ -680,7 +680,7 @@
           <w:sz w:val="18"/>
           <w:szCs w:val="18"/>
         </w:rPr>
-        <w:t xml:space="preserve">本报告依据辊的验收试验结果编制，记录了两根辊不符合第 2 部分规定的要求。执行方须在第 3 部分规定的期限内完成整改。正文以俄文、英文和中文三种语言给出，三栏内容逐行对应。</w:t>
+        <w:t xml:space="preserve">本报告依据三根辊的验收试验结果编制。辊 JG-2305-102HLB-2 试验通过；两根辊不符合第 2 部分规定的要求。执行方须在第 3 部分规定的期限内完成整改。正文以俄文、英文和中文三种语言给出，三栏内容逐行对应。</w:t>
       </w:r>
     </w:p>
     <w:p>
@@ -861,7 +861,7 @@
                 <w:sz w:val="21"/>
                 <w:szCs w:val="21"/>
               </w:rPr>
-              <w:t xml:space="preserve">Несоответствующие валы</w:t>
+              <w:t xml:space="preserve">Результаты испытаний валов</w:t>
             </w:r>
           </w:p>
         </w:tc>
@@ -907,7 +907,7 @@
                 <w:sz w:val="21"/>
                 <w:szCs w:val="21"/>
               </w:rPr>
-              <w:t xml:space="preserve">Non-conforming rolls</w:t>
+              <w:t xml:space="preserve">Roll test results</w:t>
             </w:r>
           </w:p>
         </w:tc>
@@ -953,7 +953,7 @@
                 <w:sz w:val="21"/>
                 <w:szCs w:val="21"/>
               </w:rPr>
-              <w:t xml:space="preserve">不合格辊</w:t>
+              <w:t xml:space="preserve">辊试验结果</w:t>
             </w:r>
           </w:p>
         </w:tc>
@@ -993,7 +993,16 @@
                 <w:sz w:val="17"/>
                 <w:szCs w:val="17"/>
               </w:rPr>
-              <w:t xml:space="preserve">Не соответствуют требованиям: 2 вала</w:t>
+              <w:t xml:space="preserve">Испытано валов: 3</w:t>
+            </w:r>
+            <w:r>
+              <w:rPr>
+                <w:rFonts w:ascii="Calibri" w:cs="Calibri" w:eastAsia="Microsoft YaHei" w:hAnsi="Calibri"/>
+                <w:color w:val="000000"/>
+                <w:sz w:val="17"/>
+                <w:szCs w:val="17"/>
+              </w:rPr>
+              <w:t xml:space="preserve"> — соответствует требованиям: 1, не соответствуют: 2</w:t>
             </w:r>
           </w:p>
         </w:tc>
@@ -1028,7 +1037,16 @@
                 <w:sz w:val="17"/>
                 <w:szCs w:val="17"/>
               </w:rPr>
-              <w:t xml:space="preserve">Do not meet the requirements: 2 rolls</w:t>
+              <w:t xml:space="preserve">Rolls tested: 3</w:t>
+            </w:r>
+            <w:r>
+              <w:rPr>
+                <w:rFonts w:ascii="Calibri" w:cs="Calibri" w:eastAsia="Microsoft YaHei" w:hAnsi="Calibri"/>
+                <w:color w:val="000000"/>
+                <w:sz w:val="17"/>
+                <w:szCs w:val="17"/>
+              </w:rPr>
+              <w:t xml:space="preserve"> — conforming: 1, non-conforming: 2</w:t>
             </w:r>
           </w:p>
         </w:tc>
@@ -1063,7 +1081,16 @@
                 <w:sz w:val="17"/>
                 <w:szCs w:val="17"/>
               </w:rPr>
-              <w:t xml:space="preserve">不符合要求：2 根辊</w:t>
+              <w:t xml:space="preserve">已试验辊：3 根</w:t>
+            </w:r>
+            <w:r>
+              <w:rPr>
+                <w:rFonts w:ascii="Calibri" w:cs="Calibri" w:eastAsia="Microsoft YaHei" w:hAnsi="Calibri"/>
+                <w:color w:val="000000"/>
+                <w:sz w:val="17"/>
+                <w:szCs w:val="17"/>
+              </w:rPr>
+              <w:t xml:space="preserve">——合格：1 根，不合格：2 根</w:t>
             </w:r>
           </w:p>
         </w:tc>
@@ -1382,7 +1409,7 @@
                 <w:sz w:val="17"/>
                 <w:szCs w:val="17"/>
               </w:rPr>
-              <w:t xml:space="preserve">230717-1</w:t>
+              <w:t xml:space="preserve">JG-2305-102HLB-2</w:t>
             </w:r>
             <w:r>
               <w:rPr>
@@ -1398,22 +1425,20 @@
                 <w:rFonts w:ascii="Calibri" w:cs="Calibri" w:eastAsia="Microsoft YaHei" w:hAnsi="Calibri"/>
                 <w:b/>
                 <w:bCs/>
-                <w:i/>
-                <w:iCs/>
-                <w:color w:val="000000"/>
-                <w:sz w:val="17"/>
-                <w:szCs w:val="17"/>
-              </w:rPr>
-              <w:t xml:space="preserve">не соответствует</w:t>
-            </w:r>
-            <w:r>
-              <w:rPr>
-                <w:rFonts w:ascii="Calibri" w:cs="Calibri" w:eastAsia="Microsoft YaHei" w:hAnsi="Calibri"/>
-                <w:color w:val="000000"/>
-                <w:sz w:val="17"/>
-                <w:szCs w:val="17"/>
-              </w:rPr>
-              <w:t xml:space="preserve"> требованиям, указанным в разделе 2.</w:t>
+                <w:color w:val="000000"/>
+                <w:sz w:val="17"/>
+                <w:szCs w:val="17"/>
+              </w:rPr>
+              <w:t xml:space="preserve">соответствует</w:t>
+            </w:r>
+            <w:r>
+              <w:rPr>
+                <w:rFonts w:ascii="Calibri" w:cs="Calibri" w:eastAsia="Microsoft YaHei" w:hAnsi="Calibri"/>
+                <w:color w:val="000000"/>
+                <w:sz w:val="17"/>
+                <w:szCs w:val="17"/>
+              </w:rPr>
+              <w:t xml:space="preserve"> требованиям, указанным в разделе 2. Испытания пройдены.</w:t>
             </w:r>
           </w:p>
         </w:tc>
@@ -1467,7 +1492,7 @@
                 <w:sz w:val="17"/>
                 <w:szCs w:val="17"/>
               </w:rPr>
-              <w:t xml:space="preserve">230717-1</w:t>
+              <w:t xml:space="preserve">JG-2305-102HLB-2</w:t>
             </w:r>
             <w:r>
               <w:rPr>
@@ -1483,22 +1508,20 @@
                 <w:rFonts w:ascii="Calibri" w:cs="Calibri" w:eastAsia="Microsoft YaHei" w:hAnsi="Calibri"/>
                 <w:b/>
                 <w:bCs/>
-                <w:i/>
-                <w:iCs/>
-                <w:color w:val="000000"/>
-                <w:sz w:val="17"/>
-                <w:szCs w:val="17"/>
-              </w:rPr>
-              <w:t xml:space="preserve">does not conform</w:t>
-            </w:r>
-            <w:r>
-              <w:rPr>
-                <w:rFonts w:ascii="Calibri" w:cs="Calibri" w:eastAsia="Microsoft YaHei" w:hAnsi="Calibri"/>
-                <w:color w:val="000000"/>
-                <w:sz w:val="17"/>
-                <w:szCs w:val="17"/>
-              </w:rPr>
-              <w:t xml:space="preserve"> to the requirements specified in section 2.</w:t>
+                <w:color w:val="000000"/>
+                <w:sz w:val="17"/>
+                <w:szCs w:val="17"/>
+              </w:rPr>
+              <w:t xml:space="preserve">conforms</w:t>
+            </w:r>
+            <w:r>
+              <w:rPr>
+                <w:rFonts w:ascii="Calibri" w:cs="Calibri" w:eastAsia="Microsoft YaHei" w:hAnsi="Calibri"/>
+                <w:color w:val="000000"/>
+                <w:sz w:val="17"/>
+                <w:szCs w:val="17"/>
+              </w:rPr>
+              <w:t xml:space="preserve"> to the requirements specified in section 2. The tests have been passed.</w:t>
             </w:r>
           </w:p>
         </w:tc>
@@ -1552,7 +1575,7 @@
                 <w:sz w:val="17"/>
                 <w:szCs w:val="17"/>
               </w:rPr>
-              <w:t xml:space="preserve">230717-1</w:t>
+              <w:t xml:space="preserve">JG-2305-102HLB-2</w:t>
             </w:r>
             <w:r>
               <w:rPr>
@@ -1568,22 +1591,20 @@
                 <w:rFonts w:ascii="Calibri" w:cs="Calibri" w:eastAsia="Microsoft YaHei" w:hAnsi="Calibri"/>
                 <w:b/>
                 <w:bCs/>
-                <w:i/>
-                <w:iCs/>
-                <w:color w:val="000000"/>
-                <w:sz w:val="17"/>
-                <w:szCs w:val="17"/>
-              </w:rPr>
-              <w:t xml:space="preserve">不符合</w:t>
-            </w:r>
-            <w:r>
-              <w:rPr>
-                <w:rFonts w:ascii="Calibri" w:cs="Calibri" w:eastAsia="Microsoft YaHei" w:hAnsi="Calibri"/>
-                <w:color w:val="000000"/>
-                <w:sz w:val="17"/>
-                <w:szCs w:val="17"/>
-              </w:rPr>
-              <w:t xml:space="preserve">第 2 部分规定的要求。</w:t>
+                <w:color w:val="000000"/>
+                <w:sz w:val="17"/>
+                <w:szCs w:val="17"/>
+              </w:rPr>
+              <w:t xml:space="preserve">符合</w:t>
+            </w:r>
+            <w:r>
+              <w:rPr>
+                <w:rFonts w:ascii="Calibri" w:cs="Calibri" w:eastAsia="Microsoft YaHei" w:hAnsi="Calibri"/>
+                <w:color w:val="000000"/>
+                <w:sz w:val="17"/>
+                <w:szCs w:val="17"/>
+              </w:rPr>
+              <w:t xml:space="preserve">第 2 部分规定的要求。试验通过。</w:t>
             </w:r>
           </w:p>
         </w:tc>
@@ -1596,45 +1617,84 @@
           <w:tcPr>
             <w:tcW w:type="dxa" w:w="5084"/>
             <w:tcBorders>
-              <w:top w:val="single" w:color="000000" w:sz="10"/>
+              <w:top w:val="none" w:color="FFFFFF" w:sz="0"/>
               <w:left w:val="none" w:color="FFFFFF" w:sz="0"/>
               <w:bottom w:val="single" w:color="BFBFBF" w:sz="2"/>
               <w:right w:val="single" w:color="BFBFBF" w:sz="2"/>
             </w:tcBorders>
             <w:tcMar>
-              <w:top w:type="dxa" w:w="120"/>
-              <w:left w:type="dxa" w:w="120"/>
-              <w:bottom w:type="dxa" w:w="100"/>
-              <w:right w:type="dxa" w:w="120"/>
-            </w:tcMar>
-            <w:vAlign w:val="top"/>
-          </w:tcPr>
-          <w:p>
-            <w:pPr>
-              <w:keepNext/>
-              <w:spacing w:after="0"/>
-            </w:pPr>
-            <w:r>
-              <w:rPr>
-                <w:rFonts w:ascii="Cambria" w:cs="Cambria" w:eastAsia="Microsoft YaHei" w:hAnsi="Cambria"/>
-                <w:b/>
-                <w:bCs/>
-                <w:color w:val="000000"/>
-                <w:sz w:val="21"/>
-                <w:szCs w:val="21"/>
-              </w:rPr>
-              <w:t xml:space="preserve">2. </w:t>
-            </w:r>
-            <w:r>
-              <w:rPr>
-                <w:rFonts w:ascii="Cambria" w:cs="Cambria" w:eastAsia="Microsoft YaHei" w:hAnsi="Cambria"/>
-                <w:b/>
-                <w:bCs/>
-                <w:color w:val="000000"/>
-                <w:sz w:val="21"/>
-                <w:szCs w:val="21"/>
-              </w:rPr>
-              <w:t xml:space="preserve">Измерения при температуре 90 °C</w:t>
+              <w:top w:type="dxa" w:w="70"/>
+              <w:left w:type="dxa" w:w="120"/>
+              <w:bottom w:type="dxa" w:w="70"/>
+              <w:right w:type="dxa" w:w="120"/>
+            </w:tcMar>
+            <w:vAlign w:val="top"/>
+          </w:tcPr>
+          <w:p>
+            <w:pPr>
+              <w:spacing w:after="0"/>
+            </w:pPr>
+            <w:r>
+              <w:rPr>
+                <w:rFonts w:ascii="Calibri" w:cs="Calibri" w:eastAsia="Microsoft YaHei" w:hAnsi="Calibri"/>
+                <w:b/>
+                <w:bCs/>
+                <w:color w:val="000000"/>
+                <w:sz w:val="17"/>
+                <w:szCs w:val="17"/>
+              </w:rPr>
+              <w:t xml:space="preserve">1.3  </w:t>
+            </w:r>
+            <w:r>
+              <w:rPr>
+                <w:rFonts w:ascii="Calibri" w:cs="Calibri" w:eastAsia="Microsoft YaHei" w:hAnsi="Calibri"/>
+                <w:color w:val="000000"/>
+                <w:sz w:val="17"/>
+                <w:szCs w:val="17"/>
+              </w:rPr>
+              <w:t xml:space="preserve">Вал, серийный номер </w:t>
+            </w:r>
+            <w:r>
+              <w:rPr>
+                <w:rFonts w:ascii="Calibri" w:cs="Calibri" w:eastAsia="Microsoft YaHei" w:hAnsi="Calibri"/>
+                <w:b/>
+                <w:bCs/>
+                <w:color w:val="000000"/>
+                <w:sz w:val="17"/>
+                <w:szCs w:val="17"/>
+              </w:rPr>
+              <w:t xml:space="preserve">230717-1</w:t>
+            </w:r>
+            <w:r>
+              <w:rPr>
+                <w:rFonts w:ascii="Calibri" w:cs="Calibri" w:eastAsia="Microsoft YaHei" w:hAnsi="Calibri"/>
+                <w:color w:val="000000"/>
+                <w:sz w:val="17"/>
+                <w:szCs w:val="17"/>
+              </w:rPr>
+              <w:t xml:space="preserve"> — </w:t>
+            </w:r>
+            <w:r>
+              <w:rPr>
+                <w:rFonts w:ascii="Calibri" w:cs="Calibri" w:eastAsia="Microsoft YaHei" w:hAnsi="Calibri"/>
+                <w:b/>
+                <w:bCs/>
+                <w:i/>
+                <w:iCs/>
+                <w:color w:val="000000"/>
+                <w:sz w:val="17"/>
+                <w:szCs w:val="17"/>
+              </w:rPr>
+              <w:t xml:space="preserve">не соответствует</w:t>
+            </w:r>
+            <w:r>
+              <w:rPr>
+                <w:rFonts w:ascii="Calibri" w:cs="Calibri" w:eastAsia="Microsoft YaHei" w:hAnsi="Calibri"/>
+                <w:color w:val="000000"/>
+                <w:sz w:val="17"/>
+                <w:szCs w:val="17"/>
+              </w:rPr>
+              <w:t xml:space="preserve"> требованиям, указанным в разделе 2.</w:t>
             </w:r>
           </w:p>
         </w:tc>
@@ -1642,45 +1702,84 @@
           <w:tcPr>
             <w:tcW w:type="dxa" w:w="5084"/>
             <w:tcBorders>
-              <w:top w:val="single" w:color="000000" w:sz="10"/>
+              <w:top w:val="none" w:color="FFFFFF" w:sz="0"/>
               <w:left w:val="none" w:color="FFFFFF" w:sz="0"/>
               <w:bottom w:val="single" w:color="BFBFBF" w:sz="2"/>
               <w:right w:val="single" w:color="BFBFBF" w:sz="2"/>
             </w:tcBorders>
             <w:tcMar>
-              <w:top w:type="dxa" w:w="120"/>
-              <w:left w:type="dxa" w:w="120"/>
-              <w:bottom w:type="dxa" w:w="100"/>
-              <w:right w:type="dxa" w:w="120"/>
-            </w:tcMar>
-            <w:vAlign w:val="top"/>
-          </w:tcPr>
-          <w:p>
-            <w:pPr>
-              <w:keepNext/>
-              <w:spacing w:after="0"/>
-            </w:pPr>
-            <w:r>
-              <w:rPr>
-                <w:rFonts w:ascii="Cambria" w:cs="Cambria" w:eastAsia="Microsoft YaHei" w:hAnsi="Cambria"/>
-                <w:b/>
-                <w:bCs/>
-                <w:color w:val="000000"/>
-                <w:sz w:val="21"/>
-                <w:szCs w:val="21"/>
-              </w:rPr>
-              <w:t xml:space="preserve">2. </w:t>
-            </w:r>
-            <w:r>
-              <w:rPr>
-                <w:rFonts w:ascii="Cambria" w:cs="Cambria" w:eastAsia="Microsoft YaHei" w:hAnsi="Cambria"/>
-                <w:b/>
-                <w:bCs/>
-                <w:color w:val="000000"/>
-                <w:sz w:val="21"/>
-                <w:szCs w:val="21"/>
-              </w:rPr>
-              <w:t xml:space="preserve">Measurements at a temperature of 90 °C</w:t>
+              <w:top w:type="dxa" w:w="70"/>
+              <w:left w:type="dxa" w:w="120"/>
+              <w:bottom w:type="dxa" w:w="70"/>
+              <w:right w:type="dxa" w:w="120"/>
+            </w:tcMar>
+            <w:vAlign w:val="top"/>
+          </w:tcPr>
+          <w:p>
+            <w:pPr>
+              <w:spacing w:after="0"/>
+            </w:pPr>
+            <w:r>
+              <w:rPr>
+                <w:rFonts w:ascii="Calibri" w:cs="Calibri" w:eastAsia="Microsoft YaHei" w:hAnsi="Calibri"/>
+                <w:b/>
+                <w:bCs/>
+                <w:color w:val="000000"/>
+                <w:sz w:val="17"/>
+                <w:szCs w:val="17"/>
+              </w:rPr>
+              <w:t xml:space="preserve">1.3  </w:t>
+            </w:r>
+            <w:r>
+              <w:rPr>
+                <w:rFonts w:ascii="Calibri" w:cs="Calibri" w:eastAsia="Microsoft YaHei" w:hAnsi="Calibri"/>
+                <w:color w:val="000000"/>
+                <w:sz w:val="17"/>
+                <w:szCs w:val="17"/>
+              </w:rPr>
+              <w:t xml:space="preserve">Roll, serial number </w:t>
+            </w:r>
+            <w:r>
+              <w:rPr>
+                <w:rFonts w:ascii="Calibri" w:cs="Calibri" w:eastAsia="Microsoft YaHei" w:hAnsi="Calibri"/>
+                <w:b/>
+                <w:bCs/>
+                <w:color w:val="000000"/>
+                <w:sz w:val="17"/>
+                <w:szCs w:val="17"/>
+              </w:rPr>
+              <w:t xml:space="preserve">230717-1</w:t>
+            </w:r>
+            <w:r>
+              <w:rPr>
+                <w:rFonts w:ascii="Calibri" w:cs="Calibri" w:eastAsia="Microsoft YaHei" w:hAnsi="Calibri"/>
+                <w:color w:val="000000"/>
+                <w:sz w:val="17"/>
+                <w:szCs w:val="17"/>
+              </w:rPr>
+              <w:t xml:space="preserve"> — </w:t>
+            </w:r>
+            <w:r>
+              <w:rPr>
+                <w:rFonts w:ascii="Calibri" w:cs="Calibri" w:eastAsia="Microsoft YaHei" w:hAnsi="Calibri"/>
+                <w:b/>
+                <w:bCs/>
+                <w:i/>
+                <w:iCs/>
+                <w:color w:val="000000"/>
+                <w:sz w:val="17"/>
+                <w:szCs w:val="17"/>
+              </w:rPr>
+              <w:t xml:space="preserve">does not conform</w:t>
+            </w:r>
+            <w:r>
+              <w:rPr>
+                <w:rFonts w:ascii="Calibri" w:cs="Calibri" w:eastAsia="Microsoft YaHei" w:hAnsi="Calibri"/>
+                <w:color w:val="000000"/>
+                <w:sz w:val="17"/>
+                <w:szCs w:val="17"/>
+              </w:rPr>
+              <w:t xml:space="preserve"> to the requirements specified in section 2.</w:t>
             </w:r>
           </w:p>
         </w:tc>
@@ -1688,45 +1787,84 @@
           <w:tcPr>
             <w:tcW w:type="dxa" w:w="5084"/>
             <w:tcBorders>
-              <w:top w:val="single" w:color="000000" w:sz="10"/>
+              <w:top w:val="none" w:color="FFFFFF" w:sz="0"/>
               <w:left w:val="none" w:color="FFFFFF" w:sz="0"/>
               <w:bottom w:val="single" w:color="BFBFBF" w:sz="2"/>
               <w:right w:val="none" w:color="FFFFFF" w:sz="0"/>
             </w:tcBorders>
             <w:tcMar>
-              <w:top w:type="dxa" w:w="120"/>
-              <w:left w:type="dxa" w:w="120"/>
-              <w:bottom w:type="dxa" w:w="100"/>
-              <w:right w:type="dxa" w:w="120"/>
-            </w:tcMar>
-            <w:vAlign w:val="top"/>
-          </w:tcPr>
-          <w:p>
-            <w:pPr>
-              <w:keepNext/>
-              <w:spacing w:after="0"/>
-            </w:pPr>
-            <w:r>
-              <w:rPr>
-                <w:rFonts w:ascii="Cambria" w:cs="Cambria" w:eastAsia="Microsoft YaHei" w:hAnsi="Cambria"/>
-                <w:b/>
-                <w:bCs/>
-                <w:color w:val="000000"/>
-                <w:sz w:val="21"/>
-                <w:szCs w:val="21"/>
-              </w:rPr>
-              <w:t xml:space="preserve">2. </w:t>
-            </w:r>
-            <w:r>
-              <w:rPr>
-                <w:rFonts w:ascii="Cambria" w:cs="Cambria" w:eastAsia="Microsoft YaHei" w:hAnsi="Cambria"/>
-                <w:b/>
-                <w:bCs/>
-                <w:color w:val="000000"/>
-                <w:sz w:val="21"/>
-                <w:szCs w:val="21"/>
-              </w:rPr>
-              <w:t xml:space="preserve">在 90 °C 温度下测量</w:t>
+              <w:top w:type="dxa" w:w="70"/>
+              <w:left w:type="dxa" w:w="120"/>
+              <w:bottom w:type="dxa" w:w="70"/>
+              <w:right w:type="dxa" w:w="120"/>
+            </w:tcMar>
+            <w:vAlign w:val="top"/>
+          </w:tcPr>
+          <w:p>
+            <w:pPr>
+              <w:spacing w:after="0"/>
+            </w:pPr>
+            <w:r>
+              <w:rPr>
+                <w:rFonts w:ascii="Calibri" w:cs="Calibri" w:eastAsia="Microsoft YaHei" w:hAnsi="Calibri"/>
+                <w:b/>
+                <w:bCs/>
+                <w:color w:val="000000"/>
+                <w:sz w:val="17"/>
+                <w:szCs w:val="17"/>
+              </w:rPr>
+              <w:t xml:space="preserve">1.3  </w:t>
+            </w:r>
+            <w:r>
+              <w:rPr>
+                <w:rFonts w:ascii="Calibri" w:cs="Calibri" w:eastAsia="Microsoft YaHei" w:hAnsi="Calibri"/>
+                <w:color w:val="000000"/>
+                <w:sz w:val="17"/>
+                <w:szCs w:val="17"/>
+              </w:rPr>
+              <w:t xml:space="preserve">辊，序列号 </w:t>
+            </w:r>
+            <w:r>
+              <w:rPr>
+                <w:rFonts w:ascii="Calibri" w:cs="Calibri" w:eastAsia="Microsoft YaHei" w:hAnsi="Calibri"/>
+                <w:b/>
+                <w:bCs/>
+                <w:color w:val="000000"/>
+                <w:sz w:val="17"/>
+                <w:szCs w:val="17"/>
+              </w:rPr>
+              <w:t xml:space="preserve">230717-1</w:t>
+            </w:r>
+            <w:r>
+              <w:rPr>
+                <w:rFonts w:ascii="Calibri" w:cs="Calibri" w:eastAsia="Microsoft YaHei" w:hAnsi="Calibri"/>
+                <w:color w:val="000000"/>
+                <w:sz w:val="17"/>
+                <w:szCs w:val="17"/>
+              </w:rPr>
+              <w:t xml:space="preserve">——</w:t>
+            </w:r>
+            <w:r>
+              <w:rPr>
+                <w:rFonts w:ascii="Calibri" w:cs="Calibri" w:eastAsia="Microsoft YaHei" w:hAnsi="Calibri"/>
+                <w:b/>
+                <w:bCs/>
+                <w:i/>
+                <w:iCs/>
+                <w:color w:val="000000"/>
+                <w:sz w:val="17"/>
+                <w:szCs w:val="17"/>
+              </w:rPr>
+              <w:t xml:space="preserve">不符合</w:t>
+            </w:r>
+            <w:r>
+              <w:rPr>
+                <w:rFonts w:ascii="Calibri" w:cs="Calibri" w:eastAsia="Microsoft YaHei" w:hAnsi="Calibri"/>
+                <w:color w:val="000000"/>
+                <w:sz w:val="17"/>
+                <w:szCs w:val="17"/>
+              </w:rPr>
+              <w:t xml:space="preserve">第 2 部分规定的要求。</w:t>
             </w:r>
           </w:p>
         </w:tc>
@@ -1739,62 +1877,45 @@
           <w:tcPr>
             <w:tcW w:type="dxa" w:w="5084"/>
             <w:tcBorders>
-              <w:top w:val="none" w:color="FFFFFF" w:sz="0"/>
+              <w:top w:val="single" w:color="000000" w:sz="10"/>
               <w:left w:val="none" w:color="FFFFFF" w:sz="0"/>
               <w:bottom w:val="single" w:color="BFBFBF" w:sz="2"/>
               <w:right w:val="single" w:color="BFBFBF" w:sz="2"/>
             </w:tcBorders>
             <w:tcMar>
-              <w:top w:type="dxa" w:w="70"/>
-              <w:left w:type="dxa" w:w="120"/>
-              <w:bottom w:type="dxa" w:w="70"/>
-              <w:right w:type="dxa" w:w="120"/>
-            </w:tcMar>
-            <w:vAlign w:val="top"/>
-          </w:tcPr>
-          <w:p>
-            <w:pPr>
-              <w:spacing w:after="0"/>
-            </w:pPr>
-            <w:r>
-              <w:rPr>
-                <w:rFonts w:ascii="Calibri" w:cs="Calibri" w:eastAsia="Microsoft YaHei" w:hAnsi="Calibri"/>
-                <w:b/>
-                <w:bCs/>
-                <w:color w:val="000000"/>
-                <w:sz w:val="17"/>
-                <w:szCs w:val="17"/>
-              </w:rPr>
-              <w:t xml:space="preserve">2.1  </w:t>
-            </w:r>
-            <w:r>
-              <w:rPr>
-                <w:rFonts w:ascii="Calibri" w:cs="Calibri" w:eastAsia="Microsoft YaHei" w:hAnsi="Calibri"/>
-                <w:color w:val="000000"/>
-                <w:sz w:val="17"/>
-                <w:szCs w:val="17"/>
-              </w:rPr>
-              <w:t xml:space="preserve">Проверка радиального биения: </w:t>
-            </w:r>
-            <w:r>
-              <w:rPr>
-                <w:rFonts w:ascii="Calibri" w:cs="Calibri" w:eastAsia="Microsoft YaHei" w:hAnsi="Calibri"/>
-                <w:b/>
-                <w:bCs/>
-                <w:color w:val="000000"/>
-                <w:sz w:val="17"/>
-                <w:szCs w:val="17"/>
-              </w:rPr>
-              <w:t xml:space="preserve">не более 2 мкм</w:t>
-            </w:r>
-            <w:r>
-              <w:rPr>
-                <w:rFonts w:ascii="Calibri" w:cs="Calibri" w:eastAsia="Microsoft YaHei" w:hAnsi="Calibri"/>
-                <w:color w:val="000000"/>
-                <w:sz w:val="17"/>
-                <w:szCs w:val="17"/>
-              </w:rPr>
-              <w:t xml:space="preserve"> относительно баз А и В в середине вала и на расстоянии 200 мм от краёв.</w:t>
+              <w:top w:type="dxa" w:w="120"/>
+              <w:left w:type="dxa" w:w="120"/>
+              <w:bottom w:type="dxa" w:w="100"/>
+              <w:right w:type="dxa" w:w="120"/>
+            </w:tcMar>
+            <w:vAlign w:val="top"/>
+          </w:tcPr>
+          <w:p>
+            <w:pPr>
+              <w:keepNext/>
+              <w:spacing w:after="0"/>
+            </w:pPr>
+            <w:r>
+              <w:rPr>
+                <w:rFonts w:ascii="Cambria" w:cs="Cambria" w:eastAsia="Microsoft YaHei" w:hAnsi="Cambria"/>
+                <w:b/>
+                <w:bCs/>
+                <w:color w:val="000000"/>
+                <w:sz w:val="21"/>
+                <w:szCs w:val="21"/>
+              </w:rPr>
+              <w:t xml:space="preserve">2. </w:t>
+            </w:r>
+            <w:r>
+              <w:rPr>
+                <w:rFonts w:ascii="Cambria" w:cs="Cambria" w:eastAsia="Microsoft YaHei" w:hAnsi="Cambria"/>
+                <w:b/>
+                <w:bCs/>
+                <w:color w:val="000000"/>
+                <w:sz w:val="21"/>
+                <w:szCs w:val="21"/>
+              </w:rPr>
+              <w:t xml:space="preserve">Измерения при температуре 90 °C</w:t>
             </w:r>
           </w:p>
         </w:tc>
@@ -1802,62 +1923,45 @@
           <w:tcPr>
             <w:tcW w:type="dxa" w:w="5084"/>
             <w:tcBorders>
-              <w:top w:val="none" w:color="FFFFFF" w:sz="0"/>
+              <w:top w:val="single" w:color="000000" w:sz="10"/>
               <w:left w:val="none" w:color="FFFFFF" w:sz="0"/>
               <w:bottom w:val="single" w:color="BFBFBF" w:sz="2"/>
               <w:right w:val="single" w:color="BFBFBF" w:sz="2"/>
             </w:tcBorders>
             <w:tcMar>
-              <w:top w:type="dxa" w:w="70"/>
-              <w:left w:type="dxa" w:w="120"/>
-              <w:bottom w:type="dxa" w:w="70"/>
-              <w:right w:type="dxa" w:w="120"/>
-            </w:tcMar>
-            <w:vAlign w:val="top"/>
-          </w:tcPr>
-          <w:p>
-            <w:pPr>
-              <w:spacing w:after="0"/>
-            </w:pPr>
-            <w:r>
-              <w:rPr>
-                <w:rFonts w:ascii="Calibri" w:cs="Calibri" w:eastAsia="Microsoft YaHei" w:hAnsi="Calibri"/>
-                <w:b/>
-                <w:bCs/>
-                <w:color w:val="000000"/>
-                <w:sz w:val="17"/>
-                <w:szCs w:val="17"/>
-              </w:rPr>
-              <w:t xml:space="preserve">2.1  </w:t>
-            </w:r>
-            <w:r>
-              <w:rPr>
-                <w:rFonts w:ascii="Calibri" w:cs="Calibri" w:eastAsia="Microsoft YaHei" w:hAnsi="Calibri"/>
-                <w:color w:val="000000"/>
-                <w:sz w:val="17"/>
-                <w:szCs w:val="17"/>
-              </w:rPr>
-              <w:t xml:space="preserve">Radial runout check: </w:t>
-            </w:r>
-            <w:r>
-              <w:rPr>
-                <w:rFonts w:ascii="Calibri" w:cs="Calibri" w:eastAsia="Microsoft YaHei" w:hAnsi="Calibri"/>
-                <w:b/>
-                <w:bCs/>
-                <w:color w:val="000000"/>
-                <w:sz w:val="17"/>
-                <w:szCs w:val="17"/>
-              </w:rPr>
-              <w:t xml:space="preserve">not more than 2 µm</w:t>
-            </w:r>
-            <w:r>
-              <w:rPr>
-                <w:rFonts w:ascii="Calibri" w:cs="Calibri" w:eastAsia="Microsoft YaHei" w:hAnsi="Calibri"/>
-                <w:color w:val="000000"/>
-                <w:sz w:val="17"/>
-                <w:szCs w:val="17"/>
-              </w:rPr>
-              <w:t xml:space="preserve"> relative to datums A and B at the middle of the roll and at a distance of 200 mm from the ends.</w:t>
+              <w:top w:type="dxa" w:w="120"/>
+              <w:left w:type="dxa" w:w="120"/>
+              <w:bottom w:type="dxa" w:w="100"/>
+              <w:right w:type="dxa" w:w="120"/>
+            </w:tcMar>
+            <w:vAlign w:val="top"/>
+          </w:tcPr>
+          <w:p>
+            <w:pPr>
+              <w:keepNext/>
+              <w:spacing w:after="0"/>
+            </w:pPr>
+            <w:r>
+              <w:rPr>
+                <w:rFonts w:ascii="Cambria" w:cs="Cambria" w:eastAsia="Microsoft YaHei" w:hAnsi="Cambria"/>
+                <w:b/>
+                <w:bCs/>
+                <w:color w:val="000000"/>
+                <w:sz w:val="21"/>
+                <w:szCs w:val="21"/>
+              </w:rPr>
+              <w:t xml:space="preserve">2. </w:t>
+            </w:r>
+            <w:r>
+              <w:rPr>
+                <w:rFonts w:ascii="Cambria" w:cs="Cambria" w:eastAsia="Microsoft YaHei" w:hAnsi="Cambria"/>
+                <w:b/>
+                <w:bCs/>
+                <w:color w:val="000000"/>
+                <w:sz w:val="21"/>
+                <w:szCs w:val="21"/>
+              </w:rPr>
+              <w:t xml:space="preserve">Measurements at a temperature of 90 °C</w:t>
             </w:r>
           </w:p>
         </w:tc>
@@ -1865,62 +1969,45 @@
           <w:tcPr>
             <w:tcW w:type="dxa" w:w="5084"/>
             <w:tcBorders>
-              <w:top w:val="none" w:color="FFFFFF" w:sz="0"/>
+              <w:top w:val="single" w:color="000000" w:sz="10"/>
               <w:left w:val="none" w:color="FFFFFF" w:sz="0"/>
               <w:bottom w:val="single" w:color="BFBFBF" w:sz="2"/>
               <w:right w:val="none" w:color="FFFFFF" w:sz="0"/>
             </w:tcBorders>
             <w:tcMar>
-              <w:top w:type="dxa" w:w="70"/>
-              <w:left w:type="dxa" w:w="120"/>
-              <w:bottom w:type="dxa" w:w="70"/>
-              <w:right w:type="dxa" w:w="120"/>
-            </w:tcMar>
-            <w:vAlign w:val="top"/>
-          </w:tcPr>
-          <w:p>
-            <w:pPr>
-              <w:spacing w:after="0"/>
-            </w:pPr>
-            <w:r>
-              <w:rPr>
-                <w:rFonts w:ascii="Calibri" w:cs="Calibri" w:eastAsia="Microsoft YaHei" w:hAnsi="Calibri"/>
-                <w:b/>
-                <w:bCs/>
-                <w:color w:val="000000"/>
-                <w:sz w:val="17"/>
-                <w:szCs w:val="17"/>
-              </w:rPr>
-              <w:t xml:space="preserve">2.1  </w:t>
-            </w:r>
-            <w:r>
-              <w:rPr>
-                <w:rFonts w:ascii="Calibri" w:cs="Calibri" w:eastAsia="Microsoft YaHei" w:hAnsi="Calibri"/>
-                <w:color w:val="000000"/>
-                <w:sz w:val="17"/>
-                <w:szCs w:val="17"/>
-              </w:rPr>
-              <w:t xml:space="preserve">径向跳动检查：相对于基准 A 和 B，在辊中部及距两端 200 mm 处</w:t>
-            </w:r>
-            <w:r>
-              <w:rPr>
-                <w:rFonts w:ascii="Calibri" w:cs="Calibri" w:eastAsia="Microsoft YaHei" w:hAnsi="Calibri"/>
-                <w:b/>
-                <w:bCs/>
-                <w:color w:val="000000"/>
-                <w:sz w:val="17"/>
-                <w:szCs w:val="17"/>
-              </w:rPr>
-              <w:t xml:space="preserve">不大于 2 µm</w:t>
-            </w:r>
-            <w:r>
-              <w:rPr>
-                <w:rFonts w:ascii="Calibri" w:cs="Calibri" w:eastAsia="Microsoft YaHei" w:hAnsi="Calibri"/>
-                <w:color w:val="000000"/>
-                <w:sz w:val="17"/>
-                <w:szCs w:val="17"/>
-              </w:rPr>
-              <w:t xml:space="preserve">。</w:t>
+              <w:top w:type="dxa" w:w="120"/>
+              <w:left w:type="dxa" w:w="120"/>
+              <w:bottom w:type="dxa" w:w="100"/>
+              <w:right w:type="dxa" w:w="120"/>
+            </w:tcMar>
+            <w:vAlign w:val="top"/>
+          </w:tcPr>
+          <w:p>
+            <w:pPr>
+              <w:keepNext/>
+              <w:spacing w:after="0"/>
+            </w:pPr>
+            <w:r>
+              <w:rPr>
+                <w:rFonts w:ascii="Cambria" w:cs="Cambria" w:eastAsia="Microsoft YaHei" w:hAnsi="Cambria"/>
+                <w:b/>
+                <w:bCs/>
+                <w:color w:val="000000"/>
+                <w:sz w:val="21"/>
+                <w:szCs w:val="21"/>
+              </w:rPr>
+              <w:t xml:space="preserve">2. </w:t>
+            </w:r>
+            <w:r>
+              <w:rPr>
+                <w:rFonts w:ascii="Cambria" w:cs="Cambria" w:eastAsia="Microsoft YaHei" w:hAnsi="Cambria"/>
+                <w:b/>
+                <w:bCs/>
+                <w:color w:val="000000"/>
+                <w:sz w:val="21"/>
+                <w:szCs w:val="21"/>
+              </w:rPr>
+              <w:t xml:space="preserve">在 90 °C 温度下测量</w:t>
             </w:r>
           </w:p>
         </w:tc>
@@ -1959,16 +2046,16 @@
                 <w:sz w:val="17"/>
                 <w:szCs w:val="17"/>
               </w:rPr>
-              <w:t xml:space="preserve">2.2  </w:t>
-            </w:r>
-            <w:r>
-              <w:rPr>
-                <w:rFonts w:ascii="Calibri" w:cs="Calibri" w:eastAsia="Microsoft YaHei" w:hAnsi="Calibri"/>
-                <w:color w:val="000000"/>
-                <w:sz w:val="17"/>
-                <w:szCs w:val="17"/>
-              </w:rPr>
-              <w:t xml:space="preserve">Проверка цилиндричности: </w:t>
+              <w:t xml:space="preserve">2.1  </w:t>
+            </w:r>
+            <w:r>
+              <w:rPr>
+                <w:rFonts w:ascii="Calibri" w:cs="Calibri" w:eastAsia="Microsoft YaHei" w:hAnsi="Calibri"/>
+                <w:color w:val="000000"/>
+                <w:sz w:val="17"/>
+                <w:szCs w:val="17"/>
+              </w:rPr>
+              <w:t xml:space="preserve">Проверка радиального биения: </w:t>
             </w:r>
             <w:r>
               <w:rPr>
@@ -1988,7 +2075,7 @@
                 <w:sz w:val="17"/>
                 <w:szCs w:val="17"/>
               </w:rPr>
-              <w:t xml:space="preserve"> относительно баз А и В по всей рабочей длине вала 1400 мм.</w:t>
+              <w:t xml:space="preserve"> относительно баз А и В в середине вала и на расстоянии 200 мм от краёв.</w:t>
             </w:r>
           </w:p>
         </w:tc>
@@ -2022,16 +2109,16 @@
                 <w:sz w:val="17"/>
                 <w:szCs w:val="17"/>
               </w:rPr>
-              <w:t xml:space="preserve">2.2  </w:t>
-            </w:r>
-            <w:r>
-              <w:rPr>
-                <w:rFonts w:ascii="Calibri" w:cs="Calibri" w:eastAsia="Microsoft YaHei" w:hAnsi="Calibri"/>
-                <w:color w:val="000000"/>
-                <w:sz w:val="17"/>
-                <w:szCs w:val="17"/>
-              </w:rPr>
-              <w:t xml:space="preserve">Cylindricity check: </w:t>
+              <w:t xml:space="preserve">2.1  </w:t>
+            </w:r>
+            <w:r>
+              <w:rPr>
+                <w:rFonts w:ascii="Calibri" w:cs="Calibri" w:eastAsia="Microsoft YaHei" w:hAnsi="Calibri"/>
+                <w:color w:val="000000"/>
+                <w:sz w:val="17"/>
+                <w:szCs w:val="17"/>
+              </w:rPr>
+              <w:t xml:space="preserve">Radial runout check: </w:t>
             </w:r>
             <w:r>
               <w:rPr>
@@ -2051,7 +2138,7 @@
                 <w:sz w:val="17"/>
                 <w:szCs w:val="17"/>
               </w:rPr>
-              <w:t xml:space="preserve"> relative to datums A and B over the entire working length of the roll of 1400 mm.</w:t>
+              <w:t xml:space="preserve"> relative to datums A and B at the middle of the roll and at a distance of 200 mm from the ends.</w:t>
             </w:r>
           </w:p>
         </w:tc>
@@ -2085,16 +2172,16 @@
                 <w:sz w:val="17"/>
                 <w:szCs w:val="17"/>
               </w:rPr>
-              <w:t xml:space="preserve">2.2  </w:t>
-            </w:r>
-            <w:r>
-              <w:rPr>
-                <w:rFonts w:ascii="Calibri" w:cs="Calibri" w:eastAsia="Microsoft YaHei" w:hAnsi="Calibri"/>
-                <w:color w:val="000000"/>
-                <w:sz w:val="17"/>
-                <w:szCs w:val="17"/>
-              </w:rPr>
-              <w:t xml:space="preserve">圆柱度检查：相对于基准 A 和 B，在辊整个 1400 mm 工作长度上</w:t>
+              <w:t xml:space="preserve">2.1  </w:t>
+            </w:r>
+            <w:r>
+              <w:rPr>
+                <w:rFonts w:ascii="Calibri" w:cs="Calibri" w:eastAsia="Microsoft YaHei" w:hAnsi="Calibri"/>
+                <w:color w:val="000000"/>
+                <w:sz w:val="17"/>
+                <w:szCs w:val="17"/>
+              </w:rPr>
+              <w:t xml:space="preserve">径向跳动检查：相对于基准 A 和 B，在辊中部及距两端 200 mm 处</w:t>
             </w:r>
             <w:r>
               <w:rPr>
@@ -2127,45 +2214,62 @@
           <w:tcPr>
             <w:tcW w:type="dxa" w:w="5084"/>
             <w:tcBorders>
-              <w:top w:val="single" w:color="000000" w:sz="10"/>
+              <w:top w:val="none" w:color="FFFFFF" w:sz="0"/>
               <w:left w:val="none" w:color="FFFFFF" w:sz="0"/>
               <w:bottom w:val="single" w:color="BFBFBF" w:sz="2"/>
               <w:right w:val="single" w:color="BFBFBF" w:sz="2"/>
             </w:tcBorders>
             <w:tcMar>
-              <w:top w:type="dxa" w:w="120"/>
-              <w:left w:type="dxa" w:w="120"/>
-              <w:bottom w:type="dxa" w:w="100"/>
-              <w:right w:type="dxa" w:w="120"/>
-            </w:tcMar>
-            <w:vAlign w:val="top"/>
-          </w:tcPr>
-          <w:p>
-            <w:pPr>
-              <w:keepNext/>
-              <w:spacing w:after="0"/>
-            </w:pPr>
-            <w:r>
-              <w:rPr>
-                <w:rFonts w:ascii="Cambria" w:cs="Cambria" w:eastAsia="Microsoft YaHei" w:hAnsi="Cambria"/>
-                <w:b/>
-                <w:bCs/>
-                <w:color w:val="000000"/>
-                <w:sz w:val="21"/>
-                <w:szCs w:val="21"/>
-              </w:rPr>
-              <w:t xml:space="preserve">3. </w:t>
-            </w:r>
-            <w:r>
-              <w:rPr>
-                <w:rFonts w:ascii="Cambria" w:cs="Cambria" w:eastAsia="Microsoft YaHei" w:hAnsi="Cambria"/>
-                <w:b/>
-                <w:bCs/>
-                <w:color w:val="000000"/>
-                <w:sz w:val="21"/>
-                <w:szCs w:val="21"/>
-              </w:rPr>
-              <w:t xml:space="preserve">Срок выполнения</w:t>
+              <w:top w:type="dxa" w:w="70"/>
+              <w:left w:type="dxa" w:w="120"/>
+              <w:bottom w:type="dxa" w:w="70"/>
+              <w:right w:type="dxa" w:w="120"/>
+            </w:tcMar>
+            <w:vAlign w:val="top"/>
+          </w:tcPr>
+          <w:p>
+            <w:pPr>
+              <w:spacing w:after="0"/>
+            </w:pPr>
+            <w:r>
+              <w:rPr>
+                <w:rFonts w:ascii="Calibri" w:cs="Calibri" w:eastAsia="Microsoft YaHei" w:hAnsi="Calibri"/>
+                <w:b/>
+                <w:bCs/>
+                <w:color w:val="000000"/>
+                <w:sz w:val="17"/>
+                <w:szCs w:val="17"/>
+              </w:rPr>
+              <w:t xml:space="preserve">2.2  </w:t>
+            </w:r>
+            <w:r>
+              <w:rPr>
+                <w:rFonts w:ascii="Calibri" w:cs="Calibri" w:eastAsia="Microsoft YaHei" w:hAnsi="Calibri"/>
+                <w:color w:val="000000"/>
+                <w:sz w:val="17"/>
+                <w:szCs w:val="17"/>
+              </w:rPr>
+              <w:t xml:space="preserve">Проверка цилиндричности: </w:t>
+            </w:r>
+            <w:r>
+              <w:rPr>
+                <w:rFonts w:ascii="Calibri" w:cs="Calibri" w:eastAsia="Microsoft YaHei" w:hAnsi="Calibri"/>
+                <w:b/>
+                <w:bCs/>
+                <w:color w:val="000000"/>
+                <w:sz w:val="17"/>
+                <w:szCs w:val="17"/>
+              </w:rPr>
+              <w:t xml:space="preserve">не более 2 мкм</w:t>
+            </w:r>
+            <w:r>
+              <w:rPr>
+                <w:rFonts w:ascii="Calibri" w:cs="Calibri" w:eastAsia="Microsoft YaHei" w:hAnsi="Calibri"/>
+                <w:color w:val="000000"/>
+                <w:sz w:val="17"/>
+                <w:szCs w:val="17"/>
+              </w:rPr>
+              <w:t xml:space="preserve"> относительно баз А и В по всей рабочей длине вала 1400 мм.</w:t>
             </w:r>
           </w:p>
         </w:tc>
@@ -2173,45 +2277,62 @@
           <w:tcPr>
             <w:tcW w:type="dxa" w:w="5084"/>
             <w:tcBorders>
-              <w:top w:val="single" w:color="000000" w:sz="10"/>
+              <w:top w:val="none" w:color="FFFFFF" w:sz="0"/>
               <w:left w:val="none" w:color="FFFFFF" w:sz="0"/>
               <w:bottom w:val="single" w:color="BFBFBF" w:sz="2"/>
               <w:right w:val="single" w:color="BFBFBF" w:sz="2"/>
             </w:tcBorders>
             <w:tcMar>
-              <w:top w:type="dxa" w:w="120"/>
-              <w:left w:type="dxa" w:w="120"/>
-              <w:bottom w:type="dxa" w:w="100"/>
-              <w:right w:type="dxa" w:w="120"/>
-            </w:tcMar>
-            <w:vAlign w:val="top"/>
-          </w:tcPr>
-          <w:p>
-            <w:pPr>
-              <w:keepNext/>
-              <w:spacing w:after="0"/>
-            </w:pPr>
-            <w:r>
-              <w:rPr>
-                <w:rFonts w:ascii="Cambria" w:cs="Cambria" w:eastAsia="Microsoft YaHei" w:hAnsi="Cambria"/>
-                <w:b/>
-                <w:bCs/>
-                <w:color w:val="000000"/>
-                <w:sz w:val="21"/>
-                <w:szCs w:val="21"/>
-              </w:rPr>
-              <w:t xml:space="preserve">3. </w:t>
-            </w:r>
-            <w:r>
-              <w:rPr>
-                <w:rFonts w:ascii="Cambria" w:cs="Cambria" w:eastAsia="Microsoft YaHei" w:hAnsi="Cambria"/>
-                <w:b/>
-                <w:bCs/>
-                <w:color w:val="000000"/>
-                <w:sz w:val="21"/>
-                <w:szCs w:val="21"/>
-              </w:rPr>
-              <w:t xml:space="preserve">Deadline</w:t>
+              <w:top w:type="dxa" w:w="70"/>
+              <w:left w:type="dxa" w:w="120"/>
+              <w:bottom w:type="dxa" w:w="70"/>
+              <w:right w:type="dxa" w:w="120"/>
+            </w:tcMar>
+            <w:vAlign w:val="top"/>
+          </w:tcPr>
+          <w:p>
+            <w:pPr>
+              <w:spacing w:after="0"/>
+            </w:pPr>
+            <w:r>
+              <w:rPr>
+                <w:rFonts w:ascii="Calibri" w:cs="Calibri" w:eastAsia="Microsoft YaHei" w:hAnsi="Calibri"/>
+                <w:b/>
+                <w:bCs/>
+                <w:color w:val="000000"/>
+                <w:sz w:val="17"/>
+                <w:szCs w:val="17"/>
+              </w:rPr>
+              <w:t xml:space="preserve">2.2  </w:t>
+            </w:r>
+            <w:r>
+              <w:rPr>
+                <w:rFonts w:ascii="Calibri" w:cs="Calibri" w:eastAsia="Microsoft YaHei" w:hAnsi="Calibri"/>
+                <w:color w:val="000000"/>
+                <w:sz w:val="17"/>
+                <w:szCs w:val="17"/>
+              </w:rPr>
+              <w:t xml:space="preserve">Cylindricity check: </w:t>
+            </w:r>
+            <w:r>
+              <w:rPr>
+                <w:rFonts w:ascii="Calibri" w:cs="Calibri" w:eastAsia="Microsoft YaHei" w:hAnsi="Calibri"/>
+                <w:b/>
+                <w:bCs/>
+                <w:color w:val="000000"/>
+                <w:sz w:val="17"/>
+                <w:szCs w:val="17"/>
+              </w:rPr>
+              <w:t xml:space="preserve">not more than 2 µm</w:t>
+            </w:r>
+            <w:r>
+              <w:rPr>
+                <w:rFonts w:ascii="Calibri" w:cs="Calibri" w:eastAsia="Microsoft YaHei" w:hAnsi="Calibri"/>
+                <w:color w:val="000000"/>
+                <w:sz w:val="17"/>
+                <w:szCs w:val="17"/>
+              </w:rPr>
+              <w:t xml:space="preserve"> relative to datums A and B over the entire working length of the roll of 1400 mm.</w:t>
             </w:r>
           </w:p>
         </w:tc>
@@ -2219,45 +2340,62 @@
           <w:tcPr>
             <w:tcW w:type="dxa" w:w="5084"/>
             <w:tcBorders>
-              <w:top w:val="single" w:color="000000" w:sz="10"/>
+              <w:top w:val="none" w:color="FFFFFF" w:sz="0"/>
               <w:left w:val="none" w:color="FFFFFF" w:sz="0"/>
               <w:bottom w:val="single" w:color="BFBFBF" w:sz="2"/>
               <w:right w:val="none" w:color="FFFFFF" w:sz="0"/>
             </w:tcBorders>
             <w:tcMar>
-              <w:top w:type="dxa" w:w="120"/>
-              <w:left w:type="dxa" w:w="120"/>
-              <w:bottom w:type="dxa" w:w="100"/>
-              <w:right w:type="dxa" w:w="120"/>
-            </w:tcMar>
-            <w:vAlign w:val="top"/>
-          </w:tcPr>
-          <w:p>
-            <w:pPr>
-              <w:keepNext/>
-              <w:spacing w:after="0"/>
-            </w:pPr>
-            <w:r>
-              <w:rPr>
-                <w:rFonts w:ascii="Cambria" w:cs="Cambria" w:eastAsia="Microsoft YaHei" w:hAnsi="Cambria"/>
-                <w:b/>
-                <w:bCs/>
-                <w:color w:val="000000"/>
-                <w:sz w:val="21"/>
-                <w:szCs w:val="21"/>
-              </w:rPr>
-              <w:t xml:space="preserve">3. </w:t>
-            </w:r>
-            <w:r>
-              <w:rPr>
-                <w:rFonts w:ascii="Cambria" w:cs="Cambria" w:eastAsia="Microsoft YaHei" w:hAnsi="Cambria"/>
-                <w:b/>
-                <w:bCs/>
-                <w:color w:val="000000"/>
-                <w:sz w:val="21"/>
-                <w:szCs w:val="21"/>
-              </w:rPr>
-              <w:t xml:space="preserve">完成期限</w:t>
+              <w:top w:type="dxa" w:w="70"/>
+              <w:left w:type="dxa" w:w="120"/>
+              <w:bottom w:type="dxa" w:w="70"/>
+              <w:right w:type="dxa" w:w="120"/>
+            </w:tcMar>
+            <w:vAlign w:val="top"/>
+          </w:tcPr>
+          <w:p>
+            <w:pPr>
+              <w:spacing w:after="0"/>
+            </w:pPr>
+            <w:r>
+              <w:rPr>
+                <w:rFonts w:ascii="Calibri" w:cs="Calibri" w:eastAsia="Microsoft YaHei" w:hAnsi="Calibri"/>
+                <w:b/>
+                <w:bCs/>
+                <w:color w:val="000000"/>
+                <w:sz w:val="17"/>
+                <w:szCs w:val="17"/>
+              </w:rPr>
+              <w:t xml:space="preserve">2.2  </w:t>
+            </w:r>
+            <w:r>
+              <w:rPr>
+                <w:rFonts w:ascii="Calibri" w:cs="Calibri" w:eastAsia="Microsoft YaHei" w:hAnsi="Calibri"/>
+                <w:color w:val="000000"/>
+                <w:sz w:val="17"/>
+                <w:szCs w:val="17"/>
+              </w:rPr>
+              <w:t xml:space="preserve">圆柱度检查：相对于基准 A 和 B，在辊整个 1400 mm 工作长度上</w:t>
+            </w:r>
+            <w:r>
+              <w:rPr>
+                <w:rFonts w:ascii="Calibri" w:cs="Calibri" w:eastAsia="Microsoft YaHei" w:hAnsi="Calibri"/>
+                <w:b/>
+                <w:bCs/>
+                <w:color w:val="000000"/>
+                <w:sz w:val="17"/>
+                <w:szCs w:val="17"/>
+              </w:rPr>
+              <w:t xml:space="preserve">不大于 2 µm</w:t>
+            </w:r>
+            <w:r>
+              <w:rPr>
+                <w:rFonts w:ascii="Calibri" w:cs="Calibri" w:eastAsia="Microsoft YaHei" w:hAnsi="Calibri"/>
+                <w:color w:val="000000"/>
+                <w:sz w:val="17"/>
+                <w:szCs w:val="17"/>
+              </w:rPr>
+              <w:t xml:space="preserve">。</w:t>
             </w:r>
           </w:p>
         </w:tc>
@@ -2270,12 +2408,155 @@
           <w:tcPr>
             <w:tcW w:type="dxa" w:w="5084"/>
             <w:tcBorders>
-              <w:top w:val="none" w:color="FFFFFF" w:sz="0"/>
+              <w:top w:val="single" w:color="000000" w:sz="10"/>
               <w:left w:val="none" w:color="FFFFFF" w:sz="0"/>
               <w:bottom w:val="single" w:color="BFBFBF" w:sz="2"/>
               <w:right w:val="single" w:color="BFBFBF" w:sz="2"/>
             </w:tcBorders>
             <w:tcMar>
+              <w:top w:type="dxa" w:w="120"/>
+              <w:left w:type="dxa" w:w="120"/>
+              <w:bottom w:type="dxa" w:w="100"/>
+              <w:right w:type="dxa" w:w="120"/>
+            </w:tcMar>
+            <w:vAlign w:val="top"/>
+          </w:tcPr>
+          <w:p>
+            <w:pPr>
+              <w:keepNext/>
+              <w:spacing w:after="0"/>
+            </w:pPr>
+            <w:r>
+              <w:rPr>
+                <w:rFonts w:ascii="Cambria" w:cs="Cambria" w:eastAsia="Microsoft YaHei" w:hAnsi="Cambria"/>
+                <w:b/>
+                <w:bCs/>
+                <w:color w:val="000000"/>
+                <w:sz w:val="21"/>
+                <w:szCs w:val="21"/>
+              </w:rPr>
+              <w:t xml:space="preserve">3. </w:t>
+            </w:r>
+            <w:r>
+              <w:rPr>
+                <w:rFonts w:ascii="Cambria" w:cs="Cambria" w:eastAsia="Microsoft YaHei" w:hAnsi="Cambria"/>
+                <w:b/>
+                <w:bCs/>
+                <w:color w:val="000000"/>
+                <w:sz w:val="21"/>
+                <w:szCs w:val="21"/>
+              </w:rPr>
+              <w:t xml:space="preserve">Срок выполнения</w:t>
+            </w:r>
+          </w:p>
+        </w:tc>
+        <w:tc>
+          <w:tcPr>
+            <w:tcW w:type="dxa" w:w="5084"/>
+            <w:tcBorders>
+              <w:top w:val="single" w:color="000000" w:sz="10"/>
+              <w:left w:val="none" w:color="FFFFFF" w:sz="0"/>
+              <w:bottom w:val="single" w:color="BFBFBF" w:sz="2"/>
+              <w:right w:val="single" w:color="BFBFBF" w:sz="2"/>
+            </w:tcBorders>
+            <w:tcMar>
+              <w:top w:type="dxa" w:w="120"/>
+              <w:left w:type="dxa" w:w="120"/>
+              <w:bottom w:type="dxa" w:w="100"/>
+              <w:right w:type="dxa" w:w="120"/>
+            </w:tcMar>
+            <w:vAlign w:val="top"/>
+          </w:tcPr>
+          <w:p>
+            <w:pPr>
+              <w:keepNext/>
+              <w:spacing w:after="0"/>
+            </w:pPr>
+            <w:r>
+              <w:rPr>
+                <w:rFonts w:ascii="Cambria" w:cs="Cambria" w:eastAsia="Microsoft YaHei" w:hAnsi="Cambria"/>
+                <w:b/>
+                <w:bCs/>
+                <w:color w:val="000000"/>
+                <w:sz w:val="21"/>
+                <w:szCs w:val="21"/>
+              </w:rPr>
+              <w:t xml:space="preserve">3. </w:t>
+            </w:r>
+            <w:r>
+              <w:rPr>
+                <w:rFonts w:ascii="Cambria" w:cs="Cambria" w:eastAsia="Microsoft YaHei" w:hAnsi="Cambria"/>
+                <w:b/>
+                <w:bCs/>
+                <w:color w:val="000000"/>
+                <w:sz w:val="21"/>
+                <w:szCs w:val="21"/>
+              </w:rPr>
+              <w:t xml:space="preserve">Deadline</w:t>
+            </w:r>
+          </w:p>
+        </w:tc>
+        <w:tc>
+          <w:tcPr>
+            <w:tcW w:type="dxa" w:w="5084"/>
+            <w:tcBorders>
+              <w:top w:val="single" w:color="000000" w:sz="10"/>
+              <w:left w:val="none" w:color="FFFFFF" w:sz="0"/>
+              <w:bottom w:val="single" w:color="BFBFBF" w:sz="2"/>
+              <w:right w:val="none" w:color="FFFFFF" w:sz="0"/>
+            </w:tcBorders>
+            <w:tcMar>
+              <w:top w:type="dxa" w:w="120"/>
+              <w:left w:type="dxa" w:w="120"/>
+              <w:bottom w:type="dxa" w:w="100"/>
+              <w:right w:type="dxa" w:w="120"/>
+            </w:tcMar>
+            <w:vAlign w:val="top"/>
+          </w:tcPr>
+          <w:p>
+            <w:pPr>
+              <w:keepNext/>
+              <w:spacing w:after="0"/>
+            </w:pPr>
+            <w:r>
+              <w:rPr>
+                <w:rFonts w:ascii="Cambria" w:cs="Cambria" w:eastAsia="Microsoft YaHei" w:hAnsi="Cambria"/>
+                <w:b/>
+                <w:bCs/>
+                <w:color w:val="000000"/>
+                <w:sz w:val="21"/>
+                <w:szCs w:val="21"/>
+              </w:rPr>
+              <w:t xml:space="preserve">3. </w:t>
+            </w:r>
+            <w:r>
+              <w:rPr>
+                <w:rFonts w:ascii="Cambria" w:cs="Cambria" w:eastAsia="Microsoft YaHei" w:hAnsi="Cambria"/>
+                <w:b/>
+                <w:bCs/>
+                <w:color w:val="000000"/>
+                <w:sz w:val="21"/>
+                <w:szCs w:val="21"/>
+              </w:rPr>
+              <w:t xml:space="preserve">完成期限</w:t>
+            </w:r>
+          </w:p>
+        </w:tc>
+      </w:tr>
+      <w:tr>
+        <w:trPr>
+          <w:cantSplit/>
+        </w:trPr>
+        <w:tc>
+          <w:tcPr>
+            <w:tcW w:type="dxa" w:w="5084"/>
+            <w:tcBorders>
+              <w:top w:val="none" w:color="FFFFFF" w:sz="0"/>
+              <w:left w:val="none" w:color="FFFFFF" w:sz="0"/>
+              <w:bottom w:val="single" w:color="BFBFBF" w:sz="2"/>
+              <w:right w:val="single" w:color="BFBFBF" w:sz="2"/>
+            </w:tcBorders>
+            <w:tcMar>
               <w:top w:type="dxa" w:w="70"/>
               <w:left w:type="dxa" w:w="120"/>
               <w:bottom w:type="dxa" w:w="70"/>
@@ -2301,6 +2582,55 @@
             <w:r>
               <w:rPr>
                 <w:rFonts w:ascii="Calibri" w:cs="Calibri" w:eastAsia="Microsoft YaHei" w:hAnsi="Calibri"/>
+                <w:color w:val="000000"/>
+                <w:sz w:val="17"/>
+                <w:szCs w:val="17"/>
+              </w:rPr>
+              <w:t xml:space="preserve">Устранение несоответствий по валам </w:t>
+            </w:r>
+            <w:r>
+              <w:rPr>
+                <w:rFonts w:ascii="Calibri" w:cs="Calibri" w:eastAsia="Microsoft YaHei" w:hAnsi="Calibri"/>
+                <w:b/>
+                <w:bCs/>
+                <w:color w:val="000000"/>
+                <w:sz w:val="17"/>
+                <w:szCs w:val="17"/>
+              </w:rPr>
+              <w:t xml:space="preserve">JG-2305-102HLB-1</w:t>
+            </w:r>
+            <w:r>
+              <w:rPr>
+                <w:rFonts w:ascii="Calibri" w:cs="Calibri" w:eastAsia="Microsoft YaHei" w:hAnsi="Calibri"/>
+                <w:color w:val="000000"/>
+                <w:sz w:val="17"/>
+                <w:szCs w:val="17"/>
+              </w:rPr>
+              <w:t xml:space="preserve"> и </w:t>
+            </w:r>
+            <w:r>
+              <w:rPr>
+                <w:rFonts w:ascii="Calibri" w:cs="Calibri" w:eastAsia="Microsoft YaHei" w:hAnsi="Calibri"/>
+                <w:b/>
+                <w:bCs/>
+                <w:color w:val="000000"/>
+                <w:sz w:val="17"/>
+                <w:szCs w:val="17"/>
+              </w:rPr>
+              <w:t xml:space="preserve">230717-1</w:t>
+            </w:r>
+            <w:r>
+              <w:rPr>
+                <w:rFonts w:ascii="Calibri" w:cs="Calibri" w:eastAsia="Microsoft YaHei" w:hAnsi="Calibri"/>
+                <w:color w:val="000000"/>
+                <w:sz w:val="17"/>
+                <w:szCs w:val="17"/>
+              </w:rPr>
+              <w:t xml:space="preserve"> (пп. 1.1 и 1.3): </w:t>
+            </w:r>
+            <w:r>
+              <w:rPr>
+                <w:rFonts w:ascii="Calibri" w:cs="Calibri" w:eastAsia="Microsoft YaHei" w:hAnsi="Calibri"/>
                 <w:b/>
                 <w:bCs/>
                 <w:color w:val="000000"/>
@@ -2355,6 +2685,55 @@
             <w:r>
               <w:rPr>
                 <w:rFonts w:ascii="Calibri" w:cs="Calibri" w:eastAsia="Microsoft YaHei" w:hAnsi="Calibri"/>
+                <w:color w:val="000000"/>
+                <w:sz w:val="17"/>
+                <w:szCs w:val="17"/>
+              </w:rPr>
+              <w:t xml:space="preserve">Rectification of the non-conformities of rolls </w:t>
+            </w:r>
+            <w:r>
+              <w:rPr>
+                <w:rFonts w:ascii="Calibri" w:cs="Calibri" w:eastAsia="Microsoft YaHei" w:hAnsi="Calibri"/>
+                <w:b/>
+                <w:bCs/>
+                <w:color w:val="000000"/>
+                <w:sz w:val="17"/>
+                <w:szCs w:val="17"/>
+              </w:rPr>
+              <w:t xml:space="preserve">JG-2305-102HLB-1</w:t>
+            </w:r>
+            <w:r>
+              <w:rPr>
+                <w:rFonts w:ascii="Calibri" w:cs="Calibri" w:eastAsia="Microsoft YaHei" w:hAnsi="Calibri"/>
+                <w:color w:val="000000"/>
+                <w:sz w:val="17"/>
+                <w:szCs w:val="17"/>
+              </w:rPr>
+              <w:t xml:space="preserve"> and </w:t>
+            </w:r>
+            <w:r>
+              <w:rPr>
+                <w:rFonts w:ascii="Calibri" w:cs="Calibri" w:eastAsia="Microsoft YaHei" w:hAnsi="Calibri"/>
+                <w:b/>
+                <w:bCs/>
+                <w:color w:val="000000"/>
+                <w:sz w:val="17"/>
+                <w:szCs w:val="17"/>
+              </w:rPr>
+              <w:t xml:space="preserve">230717-1</w:t>
+            </w:r>
+            <w:r>
+              <w:rPr>
+                <w:rFonts w:ascii="Calibri" w:cs="Calibri" w:eastAsia="Microsoft YaHei" w:hAnsi="Calibri"/>
+                <w:color w:val="000000"/>
+                <w:sz w:val="17"/>
+                <w:szCs w:val="17"/>
+              </w:rPr>
+              <w:t xml:space="preserve"> (items 1.1 and 1.3): </w:t>
+            </w:r>
+            <w:r>
+              <w:rPr>
+                <w:rFonts w:ascii="Calibri" w:cs="Calibri" w:eastAsia="Microsoft YaHei" w:hAnsi="Calibri"/>
                 <w:b/>
                 <w:bCs/>
                 <w:color w:val="000000"/>
@@ -2413,7 +2792,47 @@
                 <w:sz w:val="17"/>
                 <w:szCs w:val="17"/>
               </w:rPr>
-              <w:t xml:space="preserve">自本报告签署之日起 </w:t>
+              <w:t xml:space="preserve">辊 </w:t>
+            </w:r>
+            <w:r>
+              <w:rPr>
+                <w:rFonts w:ascii="Calibri" w:cs="Calibri" w:eastAsia="Microsoft YaHei" w:hAnsi="Calibri"/>
+                <w:b/>
+                <w:bCs/>
+                <w:color w:val="000000"/>
+                <w:sz w:val="17"/>
+                <w:szCs w:val="17"/>
+              </w:rPr>
+              <w:t xml:space="preserve">JG-2305-102HLB-1</w:t>
+            </w:r>
+            <w:r>
+              <w:rPr>
+                <w:rFonts w:ascii="Calibri" w:cs="Calibri" w:eastAsia="Microsoft YaHei" w:hAnsi="Calibri"/>
+                <w:color w:val="000000"/>
+                <w:sz w:val="17"/>
+                <w:szCs w:val="17"/>
+              </w:rPr>
+              <w:t xml:space="preserve"> 和 </w:t>
+            </w:r>
+            <w:r>
+              <w:rPr>
+                <w:rFonts w:ascii="Calibri" w:cs="Calibri" w:eastAsia="Microsoft YaHei" w:hAnsi="Calibri"/>
+                <w:b/>
+                <w:bCs/>
+                <w:color w:val="000000"/>
+                <w:sz w:val="17"/>
+                <w:szCs w:val="17"/>
+              </w:rPr>
+              <w:t xml:space="preserve">230717-1</w:t>
+            </w:r>
+            <w:r>
+              <w:rPr>
+                <w:rFonts w:ascii="Calibri" w:cs="Calibri" w:eastAsia="Microsoft YaHei" w:hAnsi="Calibri"/>
+                <w:color w:val="000000"/>
+                <w:sz w:val="17"/>
+                <w:szCs w:val="17"/>
+              </w:rPr>
+              <w:t xml:space="preserve">（第 1.1 和 1.3 项）的不合格整改：自本报告签署之日起 </w:t>
             </w:r>
             <w:r>
               <w:rPr>
@@ -2739,7 +3158,7 @@
           </w:tcPr>
           <w:p>
             <w:pPr>
-              <w:spacing w:after="280"/>
+              <w:spacing w:after="200"/>
             </w:pPr>
             <w:r>
               <w:rPr>
@@ -2788,7 +3207,7 @@
           </w:tcPr>
           <w:p>
             <w:pPr>
-              <w:spacing w:after="280"/>
+              <w:spacing w:after="200"/>
             </w:pPr>
             <w:r>
               <w:rPr>
@@ -2842,7 +3261,7 @@
           </w:tcPr>
           <w:p>
             <w:pPr>
-              <w:spacing w:after="280"/>
+              <w:spacing w:after="200"/>
             </w:pPr>
             <w:r>
               <w:rPr>
@@ -2891,7 +3310,7 @@
           </w:tcPr>
           <w:p>
             <w:pPr>
-              <w:spacing w:after="280"/>
+              <w:spacing w:after="200"/>
             </w:pPr>
             <w:r>
               <w:rPr>
@@ -2945,7 +3364,7 @@
           </w:tcPr>
           <w:p>
             <w:pPr>
-              <w:spacing w:after="280"/>
+              <w:spacing w:after="200"/>
             </w:pPr>
             <w:r>
               <w:rPr>
@@ -2994,7 +3413,7 @@
           </w:tcPr>
           <w:p>
             <w:pPr>
-              <w:spacing w:after="280"/>
+              <w:spacing w:after="200"/>
             </w:pPr>
             <w:r>
               <w:rPr>
@@ -3048,7 +3467,7 @@
           </w:tcPr>
           <w:p>
             <w:pPr>
-              <w:spacing w:after="600"/>
+              <w:spacing w:after="240"/>
             </w:pPr>
             <w:r>
               <w:rPr>
@@ -3080,7 +3499,7 @@
           </w:tcPr>
           <w:p>
             <w:pPr>
-              <w:spacing w:after="600"/>
+              <w:spacing w:after="240"/>
             </w:pPr>
             <w:r>
               <w:rPr>

</xml_diff>